<commit_message>
technology comparison report eklendi, isimlendirme ve fontlar değişti
</commit_message>
<xml_diff>
--- a/Docs/8-11-2025-Sprint3/Proje Kısıt ve Etkiler Dokümanı.docx
+++ b/Docs/8-11-2025-Sprint3/Proje Kısıt ve Etkiler Dokümanı.docx
@@ -6,10 +6,13 @@
       <w:pPr>
         <w:spacing w:after="240" w:before="240" w:lineRule="auto"/>
         <w:jc w:val="center"/>
-        <w:rPr/>
-      </w:pPr>
-      <w:r>
-        <w:rPr>
+        <w:rPr>
+          <w:rFonts w:ascii="Times New Roman" w:cs="Times New Roman" w:eastAsia="Times New Roman" w:hAnsi="Times New Roman"/>
+        </w:rPr>
+      </w:pPr>
+      <w:r>
+        <w:rPr>
+          <w:rFonts w:ascii="Times New Roman" w:cs="Times New Roman" w:eastAsia="Times New Roman" w:hAnsi="Times New Roman"/>
           <w:b w:val="1"/>
           <w:bCs w:val="1"/>
           <w:rtl w:val="0"/>
@@ -26,12 +29,14 @@
       <w:pPr>
         <w:spacing w:after="240" w:before="240" w:lineRule="auto"/>
         <w:rPr>
-          <w:b w:val="1"/>
-          <w:bCs w:val="1"/>
-        </w:rPr>
-      </w:pPr>
-      <w:r>
-        <w:rPr>
+          <w:rFonts w:ascii="Times New Roman" w:cs="Times New Roman" w:eastAsia="Times New Roman" w:hAnsi="Times New Roman"/>
+          <w:b w:val="1"/>
+          <w:bCs w:val="1"/>
+        </w:rPr>
+      </w:pPr>
+      <w:r>
+        <w:rPr>
+          <w:rFonts w:ascii="Times New Roman" w:cs="Times New Roman" w:eastAsia="Times New Roman" w:hAnsi="Times New Roman"/>
           <w:b w:val="1"/>
           <w:bCs w:val="1"/>
           <w:rtl w:val="0"/>
@@ -42,10 +47,13 @@
     <w:p>
       <w:pPr>
         <w:spacing w:after="240" w:before="240" w:lineRule="auto"/>
-        <w:rPr/>
-      </w:pPr>
-      <w:r>
-        <w:rPr>
+        <w:rPr>
+          <w:rFonts w:ascii="Times New Roman" w:cs="Times New Roman" w:eastAsia="Times New Roman" w:hAnsi="Times New Roman"/>
+        </w:rPr>
+      </w:pPr>
+      <w:r>
+        <w:rPr>
+          <w:rFonts w:ascii="Times New Roman" w:cs="Times New Roman" w:eastAsia="Times New Roman" w:hAnsi="Times New Roman"/>
           <w:b w:val="1"/>
           <w:bCs w:val="1"/>
           <w:rtl w:val="0"/>
@@ -54,6 +62,7 @@
       </w:r>
       <w:r>
         <w:rPr>
+          <w:rFonts w:ascii="Times New Roman" w:cs="Times New Roman" w:eastAsia="Times New Roman" w:hAnsi="Times New Roman"/>
           <w:rtl w:val="0"/>
         </w:rPr>
         <w:t xml:space="preserve">AI-Driven Cybersecurity Framework for Intelligent Threat Detection and Analysis</w:t>
@@ -62,10 +71,13 @@
     <w:p>
       <w:pPr>
         <w:spacing w:after="240" w:before="240" w:lineRule="auto"/>
-        <w:rPr/>
-      </w:pPr>
-      <w:r>
-        <w:rPr>
+        <w:rPr>
+          <w:rFonts w:ascii="Times New Roman" w:cs="Times New Roman" w:eastAsia="Times New Roman" w:hAnsi="Times New Roman"/>
+        </w:rPr>
+      </w:pPr>
+      <w:r>
+        <w:rPr>
+          <w:rFonts w:ascii="Times New Roman" w:cs="Times New Roman" w:eastAsia="Times New Roman" w:hAnsi="Times New Roman"/>
           <w:b w:val="1"/>
           <w:bCs w:val="1"/>
           <w:rtl w:val="0"/>
@@ -74,6 +86,7 @@
       </w:r>
       <w:r>
         <w:rPr>
+          <w:rFonts w:ascii="Times New Roman" w:cs="Times New Roman" w:eastAsia="Times New Roman" w:hAnsi="Times New Roman"/>
           <w:rtl w:val="0"/>
         </w:rPr>
         <w:t xml:space="preserve">Kerem ELMA, Sabri Mert PİŞKİN, Mete Cem TURAN, Mehmet ESKİ</w:t>
@@ -82,7 +95,9 @@
     <w:p>
       <w:pPr>
         <w:spacing w:after="240" w:before="240" w:lineRule="auto"/>
-        <w:rPr/>
+        <w:rPr>
+          <w:rFonts w:ascii="Times New Roman" w:cs="Times New Roman" w:eastAsia="Times New Roman" w:hAnsi="Times New Roman"/>
+        </w:rPr>
       </w:pPr>
       <w:r>
         <w:rPr>
@@ -93,10 +108,13 @@
     <w:p>
       <w:pPr>
         <w:spacing w:after="240" w:before="240" w:lineRule="auto"/>
-        <w:rPr/>
-      </w:pPr>
-      <w:r>
-        <w:rPr>
+        <w:rPr>
+          <w:rFonts w:ascii="Times New Roman" w:cs="Times New Roman" w:eastAsia="Times New Roman" w:hAnsi="Times New Roman"/>
+        </w:rPr>
+      </w:pPr>
+      <w:r>
+        <w:rPr>
+          <w:rFonts w:ascii="Times New Roman" w:cs="Times New Roman" w:eastAsia="Times New Roman" w:hAnsi="Times New Roman"/>
           <w:rtl w:val="0"/>
         </w:rPr>
         <w:tab/>
@@ -111,9 +129,13 @@
         </w:numPr>
         <w:spacing w:after="0" w:afterAutospacing="0" w:lineRule="auto"/>
         <w:ind w:left="720" w:hanging="360"/>
-      </w:pPr>
-      <w:r>
-        <w:rPr>
+        <w:rPr>
+          <w:rFonts w:ascii="Times New Roman" w:cs="Times New Roman" w:eastAsia="Times New Roman" w:hAnsi="Times New Roman"/>
+        </w:rPr>
+      </w:pPr>
+      <w:r>
+        <w:rPr>
+          <w:rFonts w:ascii="Times New Roman" w:cs="Times New Roman" w:eastAsia="Times New Roman" w:hAnsi="Times New Roman"/>
           <w:b w:val="1"/>
           <w:bCs w:val="1"/>
           <w:rtl w:val="0"/>
@@ -130,12 +152,14 @@
         </w:numPr>
         <w:ind w:left="1440" w:hanging="360"/>
         <w:rPr>
-          <w:b w:val="1"/>
-          <w:bCs w:val="1"/>
-        </w:rPr>
-      </w:pPr>
-      <w:r>
-        <w:rPr>
+          <w:rFonts w:ascii="Times New Roman" w:cs="Times New Roman" w:eastAsia="Times New Roman" w:hAnsi="Times New Roman"/>
+          <w:b w:val="1"/>
+          <w:bCs w:val="1"/>
+        </w:rPr>
+      </w:pPr>
+      <w:r>
+        <w:rPr>
+          <w:rFonts w:ascii="Times New Roman" w:cs="Times New Roman" w:eastAsia="Times New Roman" w:hAnsi="Times New Roman"/>
           <w:b w:val="1"/>
           <w:bCs w:val="1"/>
           <w:rtl w:val="0"/>
@@ -156,6 +180,7 @@
       </w:pPr>
       <w:r>
         <w:rPr>
+          <w:rFonts w:ascii="Times New Roman" w:cs="Times New Roman" w:eastAsia="Times New Roman" w:hAnsi="Times New Roman"/>
           <w:b w:val="1"/>
           <w:bCs w:val="1"/>
           <w:rtl w:val="0"/>
@@ -164,6 +189,7 @@
       </w:r>
       <w:r>
         <w:rPr>
+          <w:rFonts w:ascii="Times New Roman" w:cs="Times New Roman" w:eastAsia="Times New Roman" w:hAnsi="Times New Roman"/>
           <w:rtl w:val="0"/>
         </w:rPr>
         <w:t xml:space="preserve"> Proje yaşam döngüsü süreçlerini yapılandırmak için temel referans</w:t>
@@ -182,6 +208,7 @@
       </w:pPr>
       <w:r>
         <w:rPr>
+          <w:rFonts w:ascii="Times New Roman" w:cs="Times New Roman" w:eastAsia="Times New Roman" w:hAnsi="Times New Roman"/>
           <w:b w:val="1"/>
           <w:bCs w:val="1"/>
           <w:rtl w:val="0"/>
@@ -190,6 +217,7 @@
       </w:r>
       <w:r>
         <w:rPr>
+          <w:rFonts w:ascii="Times New Roman" w:cs="Times New Roman" w:eastAsia="Times New Roman" w:hAnsi="Times New Roman"/>
           <w:rtl w:val="0"/>
         </w:rPr>
         <w:t xml:space="preserve"> Süreç planı, gereksinim izleme, sürüm notları, proje takvimleri, teslimat kontrol listeleri</w:t>
@@ -198,7 +226,9 @@
     <w:p>
       <w:pPr>
         <w:ind w:left="720" w:firstLine="0"/>
-        <w:rPr/>
+        <w:rPr>
+          <w:rFonts w:ascii="Times New Roman" w:cs="Times New Roman" w:eastAsia="Times New Roman" w:hAnsi="Times New Roman"/>
+        </w:rPr>
       </w:pPr>
       <w:r>
         <w:rPr>
@@ -219,6 +249,7 @@
       </w:pPr>
       <w:r>
         <w:rPr>
+          <w:rFonts w:ascii="Times New Roman" w:cs="Times New Roman" w:eastAsia="Times New Roman" w:hAnsi="Times New Roman"/>
           <w:b w:val="1"/>
           <w:bCs w:val="1"/>
           <w:rtl w:val="0"/>
@@ -227,6 +258,7 @@
       </w:r>
       <w:r>
         <w:rPr>
+          <w:rFonts w:ascii="Times New Roman" w:cs="Times New Roman" w:eastAsia="Times New Roman" w:hAnsi="Times New Roman"/>
           <w:rtl w:val="0"/>
         </w:rPr>
         <w:t xml:space="preserve">  </w:t>
@@ -245,6 +277,7 @@
       </w:pPr>
       <w:r>
         <w:rPr>
+          <w:rFonts w:ascii="Times New Roman" w:cs="Times New Roman" w:eastAsia="Times New Roman" w:hAnsi="Times New Roman"/>
           <w:b w:val="1"/>
           <w:bCs w:val="1"/>
           <w:rtl w:val="0"/>
@@ -253,6 +286,7 @@
       </w:r>
       <w:r>
         <w:rPr>
+          <w:rFonts w:ascii="Times New Roman" w:cs="Times New Roman" w:eastAsia="Times New Roman" w:hAnsi="Times New Roman"/>
           <w:rtl w:val="0"/>
         </w:rPr>
         <w:t xml:space="preserve"> Veri gizliliği, erişim kontrolü ve güvenlik politikalarının belirlenmesi için uygulanacak kontrol çerçevesi</w:t>
@@ -271,6 +305,7 @@
       </w:pPr>
       <w:r>
         <w:rPr>
+          <w:rFonts w:ascii="Times New Roman" w:cs="Times New Roman" w:eastAsia="Times New Roman" w:hAnsi="Times New Roman"/>
           <w:b w:val="1"/>
           <w:bCs w:val="1"/>
           <w:rtl w:val="0"/>
@@ -279,6 +314,7 @@
       </w:r>
       <w:r>
         <w:rPr>
+          <w:rFonts w:ascii="Times New Roman" w:cs="Times New Roman" w:eastAsia="Times New Roman" w:hAnsi="Times New Roman"/>
           <w:rtl w:val="0"/>
         </w:rPr>
         <w:t xml:space="preserve"> Güvenlik politikası dokümanları, erişim logları, konfigürasyon kayıtları, risk değerlendirme raporları</w:t>
@@ -287,7 +323,9 @@
     <w:p>
       <w:pPr>
         <w:ind w:left="720" w:firstLine="0"/>
-        <w:rPr/>
+        <w:rPr>
+          <w:rFonts w:ascii="Times New Roman" w:cs="Times New Roman" w:eastAsia="Times New Roman" w:hAnsi="Times New Roman"/>
+        </w:rPr>
       </w:pPr>
       <w:r>
         <w:rPr>
@@ -303,12 +341,14 @@
         </w:numPr>
         <w:ind w:left="1440" w:hanging="360"/>
         <w:rPr>
-          <w:b w:val="1"/>
-          <w:bCs w:val="1"/>
-        </w:rPr>
-      </w:pPr>
-      <w:r>
-        <w:rPr>
+          <w:rFonts w:ascii="Times New Roman" w:cs="Times New Roman" w:eastAsia="Times New Roman" w:hAnsi="Times New Roman"/>
+          <w:b w:val="1"/>
+          <w:bCs w:val="1"/>
+        </w:rPr>
+      </w:pPr>
+      <w:r>
+        <w:rPr>
+          <w:rFonts w:ascii="Times New Roman" w:cs="Times New Roman" w:eastAsia="Times New Roman" w:hAnsi="Times New Roman"/>
           <w:b w:val="1"/>
           <w:bCs w:val="1"/>
           <w:rtl w:val="0"/>
@@ -329,6 +369,7 @@
       </w:pPr>
       <w:r>
         <w:rPr>
+          <w:rFonts w:ascii="Times New Roman" w:cs="Times New Roman" w:eastAsia="Times New Roman" w:hAnsi="Times New Roman"/>
           <w:b w:val="1"/>
           <w:bCs w:val="1"/>
           <w:rtl w:val="0"/>
@@ -337,6 +378,7 @@
       </w:r>
       <w:r>
         <w:rPr>
+          <w:rFonts w:ascii="Times New Roman" w:cs="Times New Roman" w:eastAsia="Times New Roman" w:hAnsi="Times New Roman"/>
           <w:rtl w:val="0"/>
         </w:rPr>
         <w:t xml:space="preserve"> Tehdit modelleme, saldırı sınıflandırması ve operasyonel tespit ve yanıt süreçlerinin referansı</w:t>
@@ -355,6 +397,7 @@
       </w:pPr>
       <w:r>
         <w:rPr>
+          <w:rFonts w:ascii="Times New Roman" w:cs="Times New Roman" w:eastAsia="Times New Roman" w:hAnsi="Times New Roman"/>
           <w:b w:val="1"/>
           <w:bCs w:val="1"/>
           <w:rtl w:val="0"/>
@@ -363,6 +406,7 @@
       </w:r>
       <w:r>
         <w:rPr>
+          <w:rFonts w:ascii="Times New Roman" w:cs="Times New Roman" w:eastAsia="Times New Roman" w:hAnsi="Times New Roman"/>
           <w:rtl w:val="0"/>
         </w:rPr>
         <w:t xml:space="preserve"> Tehdit modelleme dokümanları, tespit kurallarının açıklamaları, notlar ve test kayıtları</w:t>
@@ -371,7 +415,9 @@
     <w:p>
       <w:pPr>
         <w:ind w:left="720" w:firstLine="0"/>
-        <w:rPr/>
+        <w:rPr>
+          <w:rFonts w:ascii="Times New Roman" w:cs="Times New Roman" w:eastAsia="Times New Roman" w:hAnsi="Times New Roman"/>
+        </w:rPr>
       </w:pPr>
       <w:r>
         <w:rPr>
@@ -387,12 +433,14 @@
         </w:numPr>
         <w:ind w:left="1440" w:hanging="360"/>
         <w:rPr>
-          <w:b w:val="1"/>
-          <w:bCs w:val="1"/>
-        </w:rPr>
-      </w:pPr>
-      <w:r>
-        <w:rPr>
+          <w:rFonts w:ascii="Times New Roman" w:cs="Times New Roman" w:eastAsia="Times New Roman" w:hAnsi="Times New Roman"/>
+          <w:b w:val="1"/>
+          <w:bCs w:val="1"/>
+        </w:rPr>
+      </w:pPr>
+      <w:r>
+        <w:rPr>
+          <w:rFonts w:ascii="Times New Roman" w:cs="Times New Roman" w:eastAsia="Times New Roman" w:hAnsi="Times New Roman"/>
           <w:b w:val="1"/>
           <w:bCs w:val="1"/>
           <w:rtl w:val="0"/>
@@ -413,6 +461,7 @@
       </w:pPr>
       <w:r>
         <w:rPr>
+          <w:rFonts w:ascii="Times New Roman" w:cs="Times New Roman" w:eastAsia="Times New Roman" w:hAnsi="Times New Roman"/>
           <w:b w:val="1"/>
           <w:bCs w:val="1"/>
           <w:rtl w:val="0"/>
@@ -421,6 +470,7 @@
       </w:r>
       <w:r>
         <w:rPr>
+          <w:rFonts w:ascii="Times New Roman" w:cs="Times New Roman" w:eastAsia="Times New Roman" w:hAnsi="Times New Roman"/>
           <w:rtl w:val="0"/>
         </w:rPr>
         <w:t xml:space="preserve"> Web ve servis bileşenleri için güvenli geliştirme kontrolleri</w:t>
@@ -439,6 +489,7 @@
       </w:pPr>
       <w:r>
         <w:rPr>
+          <w:rFonts w:ascii="Times New Roman" w:cs="Times New Roman" w:eastAsia="Times New Roman" w:hAnsi="Times New Roman"/>
           <w:b w:val="1"/>
           <w:bCs w:val="1"/>
           <w:rtl w:val="0"/>
@@ -447,6 +498,7 @@
       </w:r>
       <w:r>
         <w:rPr>
+          <w:rFonts w:ascii="Times New Roman" w:cs="Times New Roman" w:eastAsia="Times New Roman" w:hAnsi="Times New Roman"/>
           <w:rtl w:val="0"/>
         </w:rPr>
         <w:t xml:space="preserve"> Güvenlik tarama raporları, kod inceleme kayıtları, zafiyet düzeltme listesi</w:t>
@@ -455,7 +507,9 @@
     <w:p>
       <w:pPr>
         <w:ind w:left="720" w:firstLine="0"/>
-        <w:rPr/>
+        <w:rPr>
+          <w:rFonts w:ascii="Times New Roman" w:cs="Times New Roman" w:eastAsia="Times New Roman" w:hAnsi="Times New Roman"/>
+        </w:rPr>
       </w:pPr>
       <w:r>
         <w:rPr>
@@ -471,12 +525,14 @@
         </w:numPr>
         <w:ind w:left="1440" w:hanging="360"/>
         <w:rPr>
-          <w:b w:val="1"/>
-          <w:bCs w:val="1"/>
-        </w:rPr>
-      </w:pPr>
-      <w:r>
-        <w:rPr>
+          <w:rFonts w:ascii="Times New Roman" w:cs="Times New Roman" w:eastAsia="Times New Roman" w:hAnsi="Times New Roman"/>
+          <w:b w:val="1"/>
+          <w:bCs w:val="1"/>
+        </w:rPr>
+      </w:pPr>
+      <w:r>
+        <w:rPr>
+          <w:rFonts w:ascii="Times New Roman" w:cs="Times New Roman" w:eastAsia="Times New Roman" w:hAnsi="Times New Roman"/>
           <w:b w:val="1"/>
           <w:bCs w:val="1"/>
           <w:rtl w:val="0"/>
@@ -497,6 +553,7 @@
       </w:pPr>
       <w:r>
         <w:rPr>
+          <w:rFonts w:ascii="Times New Roman" w:cs="Times New Roman" w:eastAsia="Times New Roman" w:hAnsi="Times New Roman"/>
           <w:b w:val="1"/>
           <w:bCs w:val="1"/>
           <w:rtl w:val="0"/>
@@ -505,6 +562,7 @@
       </w:r>
       <w:r>
         <w:rPr>
+          <w:rFonts w:ascii="Times New Roman" w:cs="Times New Roman" w:eastAsia="Times New Roman" w:hAnsi="Times New Roman"/>
           <w:rtl w:val="0"/>
         </w:rPr>
         <w:t xml:space="preserve"> Kişisel veri işleme, anonimleştirme ve kullanıcı hakları açısından uyumluluk gereksinimleri  </w:t>
@@ -523,6 +581,7 @@
       </w:pPr>
       <w:r>
         <w:rPr>
+          <w:rFonts w:ascii="Times New Roman" w:cs="Times New Roman" w:eastAsia="Times New Roman" w:hAnsi="Times New Roman"/>
           <w:b w:val="1"/>
           <w:bCs w:val="1"/>
           <w:rtl w:val="0"/>
@@ -531,6 +590,7 @@
       </w:r>
       <w:r>
         <w:rPr>
+          <w:rFonts w:ascii="Times New Roman" w:cs="Times New Roman" w:eastAsia="Times New Roman" w:hAnsi="Times New Roman"/>
           <w:rtl w:val="0"/>
         </w:rPr>
         <w:t xml:space="preserve"> Veri haritalama dokümanları, anonimleştirme prosedürleri, onay/çerçeve sözleşme kayıtları</w:t>
@@ -539,7 +599,9 @@
     <w:p>
       <w:pPr>
         <w:ind w:left="720" w:firstLine="0"/>
-        <w:rPr/>
+        <w:rPr>
+          <w:rFonts w:ascii="Times New Roman" w:cs="Times New Roman" w:eastAsia="Times New Roman" w:hAnsi="Times New Roman"/>
+        </w:rPr>
       </w:pPr>
       <w:r>
         <w:rPr>
@@ -550,7 +612,9 @@
     <w:p>
       <w:pPr>
         <w:ind w:left="720" w:firstLine="0"/>
-        <w:rPr/>
+        <w:rPr>
+          <w:rFonts w:ascii="Times New Roman" w:cs="Times New Roman" w:eastAsia="Times New Roman" w:hAnsi="Times New Roman"/>
+        </w:rPr>
       </w:pPr>
       <w:r>
         <w:rPr>
@@ -571,6 +635,7 @@
       </w:pPr>
       <w:r>
         <w:rPr>
+          <w:rFonts w:ascii="Times New Roman" w:cs="Times New Roman" w:eastAsia="Times New Roman" w:hAnsi="Times New Roman"/>
           <w:b w:val="1"/>
           <w:bCs w:val="1"/>
           <w:rtl w:val="0"/>
@@ -579,6 +644,7 @@
       </w:r>
       <w:r>
         <w:rPr>
+          <w:rFonts w:ascii="Times New Roman" w:cs="Times New Roman" w:eastAsia="Times New Roman" w:hAnsi="Times New Roman"/>
           <w:rtl w:val="0"/>
         </w:rPr>
         <w:t xml:space="preserve">  </w:t>
@@ -597,6 +663,7 @@
       </w:pPr>
       <w:r>
         <w:rPr>
+          <w:rFonts w:ascii="Times New Roman" w:cs="Times New Roman" w:eastAsia="Times New Roman" w:hAnsi="Times New Roman"/>
           <w:b w:val="1"/>
           <w:bCs w:val="1"/>
           <w:rtl w:val="0"/>
@@ -605,6 +672,7 @@
       </w:r>
       <w:r>
         <w:rPr>
+          <w:rFonts w:ascii="Times New Roman" w:cs="Times New Roman" w:eastAsia="Times New Roman" w:hAnsi="Times New Roman"/>
           <w:rtl w:val="0"/>
         </w:rPr>
         <w:t xml:space="preserve"> Sistem kalite gereksinimlerinin tanımlanması için</w:t>
@@ -623,6 +691,7 @@
       </w:pPr>
       <w:r>
         <w:rPr>
+          <w:rFonts w:ascii="Times New Roman" w:cs="Times New Roman" w:eastAsia="Times New Roman" w:hAnsi="Times New Roman"/>
           <w:b w:val="1"/>
           <w:bCs w:val="1"/>
           <w:rtl w:val="0"/>
@@ -631,6 +700,7 @@
       </w:r>
       <w:r>
         <w:rPr>
+          <w:rFonts w:ascii="Times New Roman" w:cs="Times New Roman" w:eastAsia="Times New Roman" w:hAnsi="Times New Roman"/>
           <w:rtl w:val="0"/>
         </w:rPr>
         <w:t xml:space="preserve"> Performans test raporları, kullanılabilirlik değerlendirmeleri, doğrulama testleri</w:t>
@@ -639,7 +709,9 @@
     <w:p>
       <w:pPr>
         <w:ind w:left="720" w:firstLine="0"/>
-        <w:rPr/>
+        <w:rPr>
+          <w:rFonts w:ascii="Times New Roman" w:cs="Times New Roman" w:eastAsia="Times New Roman" w:hAnsi="Times New Roman"/>
+        </w:rPr>
       </w:pPr>
       <w:r>
         <w:rPr>
@@ -655,12 +727,14 @@
         </w:numPr>
         <w:ind w:left="1440" w:hanging="360"/>
         <w:rPr>
-          <w:b w:val="1"/>
-          <w:bCs w:val="1"/>
-        </w:rPr>
-      </w:pPr>
-      <w:r>
-        <w:rPr>
+          <w:rFonts w:ascii="Times New Roman" w:cs="Times New Roman" w:eastAsia="Times New Roman" w:hAnsi="Times New Roman"/>
+          <w:b w:val="1"/>
+          <w:bCs w:val="1"/>
+        </w:rPr>
+      </w:pPr>
+      <w:r>
+        <w:rPr>
+          <w:rFonts w:ascii="Times New Roman" w:cs="Times New Roman" w:eastAsia="Times New Roman" w:hAnsi="Times New Roman"/>
           <w:b w:val="1"/>
           <w:bCs w:val="1"/>
           <w:rtl w:val="0"/>
@@ -681,6 +755,7 @@
       </w:pPr>
       <w:r>
         <w:rPr>
+          <w:rFonts w:ascii="Times New Roman" w:cs="Times New Roman" w:eastAsia="Times New Roman" w:hAnsi="Times New Roman"/>
           <w:b w:val="1"/>
           <w:bCs w:val="1"/>
           <w:rtl w:val="0"/>
@@ -689,6 +764,7 @@
       </w:r>
       <w:r>
         <w:rPr>
+          <w:rFonts w:ascii="Times New Roman" w:cs="Times New Roman" w:eastAsia="Times New Roman" w:hAnsi="Times New Roman"/>
           <w:rtl w:val="0"/>
         </w:rPr>
         <w:t xml:space="preserve"> Test planlaması, test vakaları ve test raporlarının standardize edilmesi için</w:t>
@@ -707,6 +783,7 @@
       </w:pPr>
       <w:r>
         <w:rPr>
+          <w:rFonts w:ascii="Times New Roman" w:cs="Times New Roman" w:eastAsia="Times New Roman" w:hAnsi="Times New Roman"/>
           <w:b w:val="1"/>
           <w:bCs w:val="1"/>
           <w:rtl w:val="0"/>
@@ -715,6 +792,7 @@
       </w:r>
       <w:r>
         <w:rPr>
+          <w:rFonts w:ascii="Times New Roman" w:cs="Times New Roman" w:eastAsia="Times New Roman" w:hAnsi="Times New Roman"/>
           <w:rtl w:val="0"/>
         </w:rPr>
         <w:t xml:space="preserve"> Test planı, test vakaları, test sonuç raporları</w:t>
@@ -722,17 +800,21 @@
     </w:p>
     <w:p>
       <w:pPr>
-        <w:rPr/>
-      </w:pPr>
-      <w:r>
-        <w:rPr>
-          <w:rtl w:val="0"/>
-        </w:rPr>
-      </w:r>
-    </w:p>
-    <w:p>
-      <w:pPr>
-        <w:rPr/>
+        <w:rPr>
+          <w:rFonts w:ascii="Times New Roman" w:cs="Times New Roman" w:eastAsia="Times New Roman" w:hAnsi="Times New Roman"/>
+        </w:rPr>
+      </w:pPr>
+      <w:r>
+        <w:rPr>
+          <w:rtl w:val="0"/>
+        </w:rPr>
+      </w:r>
+    </w:p>
+    <w:p>
+      <w:pPr>
+        <w:rPr>
+          <w:rFonts w:ascii="Times New Roman" w:cs="Times New Roman" w:eastAsia="Times New Roman" w:hAnsi="Times New Roman"/>
+        </w:rPr>
       </w:pPr>
       <w:r>
         <w:rPr>
@@ -748,9 +830,13 @@
         </w:numPr>
         <w:spacing w:after="0" w:afterAutospacing="0" w:lineRule="auto"/>
         <w:ind w:left="720" w:hanging="360"/>
-      </w:pPr>
-      <w:r>
-        <w:rPr>
+        <w:rPr>
+          <w:rFonts w:ascii="Times New Roman" w:cs="Times New Roman" w:eastAsia="Times New Roman" w:hAnsi="Times New Roman"/>
+        </w:rPr>
+      </w:pPr>
+      <w:r>
+        <w:rPr>
+          <w:rFonts w:ascii="Times New Roman" w:cs="Times New Roman" w:eastAsia="Times New Roman" w:hAnsi="Times New Roman"/>
           <w:b w:val="1"/>
           <w:bCs w:val="1"/>
           <w:rtl w:val="0"/>
@@ -767,12 +853,14 @@
         </w:numPr>
         <w:ind w:left="1440" w:hanging="360"/>
         <w:rPr>
-          <w:b w:val="1"/>
-          <w:bCs w:val="1"/>
-        </w:rPr>
-      </w:pPr>
-      <w:r>
-        <w:rPr>
+          <w:rFonts w:ascii="Times New Roman" w:cs="Times New Roman" w:eastAsia="Times New Roman" w:hAnsi="Times New Roman"/>
+          <w:b w:val="1"/>
+          <w:bCs w:val="1"/>
+        </w:rPr>
+      </w:pPr>
+      <w:r>
+        <w:rPr>
+          <w:rFonts w:ascii="Times New Roman" w:cs="Times New Roman" w:eastAsia="Times New Roman" w:hAnsi="Times New Roman"/>
           <w:b w:val="1"/>
           <w:bCs w:val="1"/>
           <w:rtl w:val="0"/>
@@ -793,6 +881,7 @@
       </w:pPr>
       <w:r>
         <w:rPr>
+          <w:rFonts w:ascii="Times New Roman" w:cs="Times New Roman" w:eastAsia="Times New Roman" w:hAnsi="Times New Roman"/>
           <w:b w:val="1"/>
           <w:bCs w:val="1"/>
           <w:rtl w:val="0"/>
@@ -801,6 +890,7 @@
       </w:r>
       <w:r>
         <w:rPr>
+          <w:rFonts w:ascii="Times New Roman" w:cs="Times New Roman" w:eastAsia="Times New Roman" w:hAnsi="Times New Roman"/>
           <w:rtl w:val="0"/>
         </w:rPr>
         <w:t xml:space="preserve"> Proje bir akademik dönemde tamamlanacaktır; bu süre model eğitimleri, veri toplama ve ayrıntılı entegrasyon ve implementasyon için sınırlıdır.</w:t>
@@ -819,6 +909,7 @@
       </w:pPr>
       <w:r>
         <w:rPr>
+          <w:rFonts w:ascii="Times New Roman" w:cs="Times New Roman" w:eastAsia="Times New Roman" w:hAnsi="Times New Roman"/>
           <w:b w:val="1"/>
           <w:bCs w:val="1"/>
           <w:rtl w:val="0"/>
@@ -827,6 +918,7 @@
       </w:r>
       <w:r>
         <w:rPr>
+          <w:rFonts w:ascii="Times New Roman" w:cs="Times New Roman" w:eastAsia="Times New Roman" w:hAnsi="Times New Roman"/>
           <w:rtl w:val="0"/>
         </w:rPr>
         <w:t xml:space="preserve"> Özellik seçimi, hiper parametre optimizasyonu, geniş ölçekli saha testleri ve kapsamlı performans değerlendirmeleri kısıtlanabilir.  </w:t>
@@ -845,6 +937,7 @@
       </w:pPr>
       <w:r>
         <w:rPr>
+          <w:rFonts w:ascii="Times New Roman" w:cs="Times New Roman" w:eastAsia="Times New Roman" w:hAnsi="Times New Roman"/>
           <w:b w:val="1"/>
           <w:bCs w:val="1"/>
           <w:rtl w:val="0"/>
@@ -853,6 +946,7 @@
       </w:r>
       <w:r>
         <w:rPr>
+          <w:rFonts w:ascii="Times New Roman" w:cs="Times New Roman" w:eastAsia="Times New Roman" w:hAnsi="Times New Roman"/>
           <w:rtl w:val="0"/>
         </w:rPr>
         <w:t xml:space="preserve"> Proje zaman çizelgesi, sprint teslimleri, ara raporlar ve teslim tarihleri ile ilerleme izleme; tamamlanan kilometre taşlarına ilişkin demo kayıtları.</w:t>
@@ -861,7 +955,9 @@
     <w:p>
       <w:pPr>
         <w:ind w:left="720" w:firstLine="0"/>
-        <w:rPr/>
+        <w:rPr>
+          <w:rFonts w:ascii="Times New Roman" w:cs="Times New Roman" w:eastAsia="Times New Roman" w:hAnsi="Times New Roman"/>
+        </w:rPr>
       </w:pPr>
       <w:r>
         <w:rPr>
@@ -877,12 +973,14 @@
         </w:numPr>
         <w:ind w:left="1440" w:hanging="360"/>
         <w:rPr>
-          <w:b w:val="1"/>
-          <w:bCs w:val="1"/>
-        </w:rPr>
-      </w:pPr>
-      <w:r>
-        <w:rPr>
+          <w:rFonts w:ascii="Times New Roman" w:cs="Times New Roman" w:eastAsia="Times New Roman" w:hAnsi="Times New Roman"/>
+          <w:b w:val="1"/>
+          <w:bCs w:val="1"/>
+        </w:rPr>
+      </w:pPr>
+      <w:r>
+        <w:rPr>
+          <w:rFonts w:ascii="Times New Roman" w:cs="Times New Roman" w:eastAsia="Times New Roman" w:hAnsi="Times New Roman"/>
           <w:b w:val="1"/>
           <w:bCs w:val="1"/>
           <w:rtl w:val="0"/>
@@ -903,6 +1001,7 @@
       </w:pPr>
       <w:r>
         <w:rPr>
+          <w:rFonts w:ascii="Times New Roman" w:cs="Times New Roman" w:eastAsia="Times New Roman" w:hAnsi="Times New Roman"/>
           <w:b w:val="1"/>
           <w:bCs w:val="1"/>
           <w:rtl w:val="0"/>
@@ -911,6 +1010,7 @@
       </w:r>
       <w:r>
         <w:rPr>
+          <w:rFonts w:ascii="Times New Roman" w:cs="Times New Roman" w:eastAsia="Times New Roman" w:hAnsi="Times New Roman"/>
           <w:rtl w:val="0"/>
         </w:rPr>
         <w:t xml:space="preserve"> Yeterli boyut ve çeşitlilikte, etik ve yasal koşulları karşılayan saldırı/veri örneklerine erişim sınırlı olabilir.  </w:t>
@@ -929,6 +1029,7 @@
       </w:pPr>
       <w:r>
         <w:rPr>
+          <w:rFonts w:ascii="Times New Roman" w:cs="Times New Roman" w:eastAsia="Times New Roman" w:hAnsi="Times New Roman"/>
           <w:b w:val="1"/>
           <w:bCs w:val="1"/>
           <w:rtl w:val="0"/>
@@ -937,6 +1038,7 @@
       </w:r>
       <w:r>
         <w:rPr>
+          <w:rFonts w:ascii="Times New Roman" w:cs="Times New Roman" w:eastAsia="Times New Roman" w:hAnsi="Times New Roman"/>
           <w:rtl w:val="0"/>
         </w:rPr>
         <w:t xml:space="preserve"> Model genelleştirilebilirliği, düşük veri türleri için overfitting riski, gerçek dünya başarımının sınırlı değerlendirilmesi.  </w:t>
@@ -955,6 +1057,7 @@
       </w:pPr>
       <w:r>
         <w:rPr>
+          <w:rFonts w:ascii="Times New Roman" w:cs="Times New Roman" w:eastAsia="Times New Roman" w:hAnsi="Times New Roman"/>
           <w:b w:val="1"/>
           <w:bCs w:val="1"/>
           <w:rtl w:val="0"/>
@@ -963,6 +1066,7 @@
       </w:r>
       <w:r>
         <w:rPr>
+          <w:rFonts w:ascii="Times New Roman" w:cs="Times New Roman" w:eastAsia="Times New Roman" w:hAnsi="Times New Roman"/>
           <w:rtl w:val="0"/>
         </w:rPr>
         <w:t xml:space="preserve"> Kullanılan veri setlerinin listesi ve kaynakları, veri ön işleme raporları, anonimleştirme ve etik onay kayıtları, veri dağılım istatistikleri</w:t>
@@ -971,7 +1075,9 @@
     <w:p>
       <w:pPr>
         <w:ind w:left="1440" w:firstLine="0"/>
-        <w:rPr/>
+        <w:rPr>
+          <w:rFonts w:ascii="Times New Roman" w:cs="Times New Roman" w:eastAsia="Times New Roman" w:hAnsi="Times New Roman"/>
+        </w:rPr>
       </w:pPr>
       <w:r>
         <w:rPr>
@@ -987,12 +1093,14 @@
         </w:numPr>
         <w:ind w:left="1440" w:hanging="360"/>
         <w:rPr>
-          <w:b w:val="1"/>
-          <w:bCs w:val="1"/>
-        </w:rPr>
-      </w:pPr>
-      <w:r>
-        <w:rPr>
+          <w:rFonts w:ascii="Times New Roman" w:cs="Times New Roman" w:eastAsia="Times New Roman" w:hAnsi="Times New Roman"/>
+          <w:b w:val="1"/>
+          <w:bCs w:val="1"/>
+        </w:rPr>
+      </w:pPr>
+      <w:r>
+        <w:rPr>
+          <w:rFonts w:ascii="Times New Roman" w:cs="Times New Roman" w:eastAsia="Times New Roman" w:hAnsi="Times New Roman"/>
           <w:b w:val="1"/>
           <w:bCs w:val="1"/>
           <w:rtl w:val="0"/>
@@ -1013,6 +1121,7 @@
       </w:pPr>
       <w:r>
         <w:rPr>
+          <w:rFonts w:ascii="Times New Roman" w:cs="Times New Roman" w:eastAsia="Times New Roman" w:hAnsi="Times New Roman"/>
           <w:b w:val="1"/>
           <w:bCs w:val="1"/>
           <w:rtl w:val="0"/>
@@ -1021,6 +1130,7 @@
       </w:r>
       <w:r>
         <w:rPr>
+          <w:rFonts w:ascii="Times New Roman" w:cs="Times New Roman" w:eastAsia="Times New Roman" w:hAnsi="Times New Roman"/>
           <w:rtl w:val="0"/>
         </w:rPr>
         <w:t xml:space="preserve"> Derin öğrenme modelleri için yeterli GPU saatleri ve depolama maliyeti sınırlı olabilir.  </w:t>
@@ -1039,6 +1149,7 @@
       </w:pPr>
       <w:r>
         <w:rPr>
+          <w:rFonts w:ascii="Times New Roman" w:cs="Times New Roman" w:eastAsia="Times New Roman" w:hAnsi="Times New Roman"/>
           <w:b w:val="1"/>
           <w:bCs w:val="1"/>
           <w:rtl w:val="0"/>
@@ -1047,6 +1158,7 @@
       </w:r>
       <w:r>
         <w:rPr>
+          <w:rFonts w:ascii="Times New Roman" w:cs="Times New Roman" w:eastAsia="Times New Roman" w:hAnsi="Times New Roman"/>
           <w:rtl w:val="0"/>
         </w:rPr>
         <w:t xml:space="preserve"> Model karmaşıklığı, deney sayısı, eğitim tekrarları ve hiper parametre aramalarına etki eder.  </w:t>
@@ -1065,6 +1177,7 @@
       </w:pPr>
       <w:r>
         <w:rPr>
+          <w:rFonts w:ascii="Times New Roman" w:cs="Times New Roman" w:eastAsia="Times New Roman" w:hAnsi="Times New Roman"/>
           <w:b w:val="1"/>
           <w:bCs w:val="1"/>
           <w:rtl w:val="0"/>
@@ -1073,6 +1186,7 @@
       </w:r>
       <w:r>
         <w:rPr>
+          <w:rFonts w:ascii="Times New Roman" w:cs="Times New Roman" w:eastAsia="Times New Roman" w:hAnsi="Times New Roman"/>
           <w:rtl w:val="0"/>
         </w:rPr>
         <w:t xml:space="preserve"> Kaynak kullanım raporları, model eğitim kayıtları, hesaplama optimizasyon raporları.</w:t>
@@ -1081,7 +1195,9 @@
     <w:p>
       <w:pPr>
         <w:ind w:left="1440" w:firstLine="0"/>
-        <w:rPr/>
+        <w:rPr>
+          <w:rFonts w:ascii="Times New Roman" w:cs="Times New Roman" w:eastAsia="Times New Roman" w:hAnsi="Times New Roman"/>
+        </w:rPr>
       </w:pPr>
       <w:r>
         <w:rPr>
@@ -1097,12 +1213,14 @@
         </w:numPr>
         <w:ind w:left="1440" w:hanging="360"/>
         <w:rPr>
-          <w:b w:val="1"/>
-          <w:bCs w:val="1"/>
-        </w:rPr>
-      </w:pPr>
-      <w:r>
-        <w:rPr>
+          <w:rFonts w:ascii="Times New Roman" w:cs="Times New Roman" w:eastAsia="Times New Roman" w:hAnsi="Times New Roman"/>
+          <w:b w:val="1"/>
+          <w:bCs w:val="1"/>
+        </w:rPr>
+      </w:pPr>
+      <w:r>
+        <w:rPr>
+          <w:rFonts w:ascii="Times New Roman" w:cs="Times New Roman" w:eastAsia="Times New Roman" w:hAnsi="Times New Roman"/>
           <w:b w:val="1"/>
           <w:bCs w:val="1"/>
           <w:rtl w:val="0"/>
@@ -1123,6 +1241,7 @@
       </w:pPr>
       <w:r>
         <w:rPr>
+          <w:rFonts w:ascii="Times New Roman" w:cs="Times New Roman" w:eastAsia="Times New Roman" w:hAnsi="Times New Roman"/>
           <w:b w:val="1"/>
           <w:bCs w:val="1"/>
           <w:rtl w:val="0"/>
@@ -1131,6 +1250,7 @@
       </w:r>
       <w:r>
         <w:rPr>
+          <w:rFonts w:ascii="Times New Roman" w:cs="Times New Roman" w:eastAsia="Times New Roman" w:hAnsi="Times New Roman"/>
           <w:rtl w:val="0"/>
         </w:rPr>
         <w:t xml:space="preserve"> Gerçek ağlarda simülasyon yapmak ve kişisel veri işlemek hukuki sınırlamalara tabidir. İzinsiz testler/penetrasyonlar yapılamaz.  </w:t>
@@ -1149,6 +1269,7 @@
       </w:pPr>
       <w:r>
         <w:rPr>
+          <w:rFonts w:ascii="Times New Roman" w:cs="Times New Roman" w:eastAsia="Times New Roman" w:hAnsi="Times New Roman"/>
           <w:b w:val="1"/>
           <w:bCs w:val="1"/>
           <w:rtl w:val="0"/>
@@ -1157,6 +1278,7 @@
       </w:r>
       <w:r>
         <w:rPr>
+          <w:rFonts w:ascii="Times New Roman" w:cs="Times New Roman" w:eastAsia="Times New Roman" w:hAnsi="Times New Roman"/>
           <w:rtl w:val="0"/>
         </w:rPr>
         <w:t xml:space="preserve"> Toplanan veri miktarı ve testlerin kapsamı sınırlanır; ek etik onaylar gerekebilir.  </w:t>
@@ -1175,6 +1297,7 @@
       </w:pPr>
       <w:r>
         <w:rPr>
+          <w:rFonts w:ascii="Times New Roman" w:cs="Times New Roman" w:eastAsia="Times New Roman" w:hAnsi="Times New Roman"/>
           <w:b w:val="1"/>
           <w:bCs w:val="1"/>
           <w:rtl w:val="0"/>
@@ -1183,6 +1306,7 @@
       </w:r>
       <w:r>
         <w:rPr>
+          <w:rFonts w:ascii="Times New Roman" w:cs="Times New Roman" w:eastAsia="Times New Roman" w:hAnsi="Times New Roman"/>
           <w:rtl w:val="0"/>
         </w:rPr>
         <w:t xml:space="preserve"> Etik kurullar/kurum içi onay belgeleri, test onay formları, veri anonimleştirme prosedürleri ve kayıtları.</w:t>
@@ -1192,7 +1316,9 @@
       <w:pPr>
         <w:spacing w:after="240" w:before="240" w:lineRule="auto"/>
         <w:ind w:left="720" w:firstLine="0"/>
-        <w:rPr/>
+        <w:rPr>
+          <w:rFonts w:ascii="Times New Roman" w:cs="Times New Roman" w:eastAsia="Times New Roman" w:hAnsi="Times New Roman"/>
+        </w:rPr>
       </w:pPr>
       <w:r>
         <w:rPr>
@@ -1208,9 +1334,13 @@
         </w:numPr>
         <w:spacing w:after="0" w:afterAutospacing="0" w:lineRule="auto"/>
         <w:ind w:left="720" w:hanging="360"/>
-      </w:pPr>
-      <w:r>
-        <w:rPr>
+        <w:rPr>
+          <w:rFonts w:ascii="Times New Roman" w:cs="Times New Roman" w:eastAsia="Times New Roman" w:hAnsi="Times New Roman"/>
+        </w:rPr>
+      </w:pPr>
+      <w:r>
+        <w:rPr>
+          <w:rFonts w:ascii="Times New Roman" w:cs="Times New Roman" w:eastAsia="Times New Roman" w:hAnsi="Times New Roman"/>
           <w:b w:val="1"/>
           <w:bCs w:val="1"/>
           <w:rtl w:val="0"/>
@@ -1232,12 +1362,14 @@
         </w:numPr>
         <w:ind w:left="1440" w:hanging="360"/>
         <w:rPr>
-          <w:b w:val="1"/>
-          <w:bCs w:val="1"/>
-        </w:rPr>
-      </w:pPr>
-      <w:r>
-        <w:rPr>
+          <w:rFonts w:ascii="Times New Roman" w:cs="Times New Roman" w:eastAsia="Times New Roman" w:hAnsi="Times New Roman"/>
+          <w:b w:val="1"/>
+          <w:bCs w:val="1"/>
+        </w:rPr>
+      </w:pPr>
+      <w:r>
+        <w:rPr>
+          <w:rFonts w:ascii="Times New Roman" w:cs="Times New Roman" w:eastAsia="Times New Roman" w:hAnsi="Times New Roman"/>
           <w:b w:val="1"/>
           <w:bCs w:val="1"/>
           <w:rtl w:val="0"/>
@@ -1258,6 +1390,7 @@
       </w:pPr>
       <w:r>
         <w:rPr>
+          <w:rFonts w:ascii="Times New Roman" w:cs="Times New Roman" w:eastAsia="Times New Roman" w:hAnsi="Times New Roman"/>
           <w:b w:val="1"/>
           <w:bCs w:val="1"/>
           <w:rtl w:val="0"/>
@@ -1266,6 +1399,7 @@
       </w:r>
       <w:r>
         <w:rPr>
+          <w:rFonts w:ascii="Times New Roman" w:cs="Times New Roman" w:eastAsia="Times New Roman" w:hAnsi="Times New Roman"/>
           <w:rtl w:val="0"/>
         </w:rPr>
         <w:t xml:space="preserve"> SOC operasyonel maliyetlerinde azalma, daha hızlı zafiyet önceliklendirmesi ile kritik yamaların gecikmesinden doğan maliyetlerin düşürülmesi.</w:t>
@@ -1284,6 +1418,7 @@
       </w:pPr>
       <w:r>
         <w:rPr>
+          <w:rFonts w:ascii="Times New Roman" w:cs="Times New Roman" w:eastAsia="Times New Roman" w:hAnsi="Times New Roman"/>
           <w:b w:val="1"/>
           <w:bCs w:val="1"/>
           <w:rtl w:val="0"/>
@@ -1292,6 +1427,7 @@
       </w:r>
       <w:r>
         <w:rPr>
+          <w:rFonts w:ascii="Times New Roman" w:cs="Times New Roman" w:eastAsia="Times New Roman" w:hAnsi="Times New Roman"/>
           <w:rtl w:val="0"/>
         </w:rPr>
         <w:t xml:space="preserve"> Başlangıç geliştirme ve eğitim kaynakları maliyeti.  </w:t>
@@ -1310,6 +1446,7 @@
       </w:pPr>
       <w:r>
         <w:rPr>
+          <w:rFonts w:ascii="Times New Roman" w:cs="Times New Roman" w:eastAsia="Times New Roman" w:hAnsi="Times New Roman"/>
           <w:b w:val="1"/>
           <w:bCs w:val="1"/>
           <w:rtl w:val="0"/>
@@ -1318,6 +1455,7 @@
       </w:r>
       <w:r>
         <w:rPr>
+          <w:rFonts w:ascii="Times New Roman" w:cs="Times New Roman" w:eastAsia="Times New Roman" w:hAnsi="Times New Roman"/>
           <w:rtl w:val="0"/>
         </w:rPr>
         <w:t xml:space="preserve"> Kademeli pilot dağıtımları, model optimizasyonu ve açık kaynak bileşenlerin kullanımı.</w:t>
@@ -1326,7 +1464,9 @@
     <w:p>
       <w:pPr>
         <w:ind w:left="1440" w:firstLine="0"/>
-        <w:rPr/>
+        <w:rPr>
+          <w:rFonts w:ascii="Times New Roman" w:cs="Times New Roman" w:eastAsia="Times New Roman" w:hAnsi="Times New Roman"/>
+        </w:rPr>
       </w:pPr>
       <w:r>
         <w:rPr>
@@ -1342,12 +1482,14 @@
         </w:numPr>
         <w:ind w:left="1440" w:hanging="360"/>
         <w:rPr>
-          <w:b w:val="1"/>
-          <w:bCs w:val="1"/>
-        </w:rPr>
-      </w:pPr>
-      <w:r>
-        <w:rPr>
+          <w:rFonts w:ascii="Times New Roman" w:cs="Times New Roman" w:eastAsia="Times New Roman" w:hAnsi="Times New Roman"/>
+          <w:b w:val="1"/>
+          <w:bCs w:val="1"/>
+        </w:rPr>
+      </w:pPr>
+      <w:r>
+        <w:rPr>
+          <w:rFonts w:ascii="Times New Roman" w:cs="Times New Roman" w:eastAsia="Times New Roman" w:hAnsi="Times New Roman"/>
           <w:b w:val="1"/>
           <w:bCs w:val="1"/>
           <w:rtl w:val="0"/>
@@ -1368,6 +1510,7 @@
       </w:pPr>
       <w:r>
         <w:rPr>
+          <w:rFonts w:ascii="Times New Roman" w:cs="Times New Roman" w:eastAsia="Times New Roman" w:hAnsi="Times New Roman"/>
           <w:b w:val="1"/>
           <w:bCs w:val="1"/>
           <w:rtl w:val="0"/>
@@ -1376,6 +1519,7 @@
       </w:r>
       <w:r>
         <w:rPr>
+          <w:rFonts w:ascii="Times New Roman" w:cs="Times New Roman" w:eastAsia="Times New Roman" w:hAnsi="Times New Roman"/>
           <w:rtl w:val="0"/>
         </w:rPr>
         <w:t xml:space="preserve"> Çalışanlar ve müşteriler için artan güven, analistlerin monoton görevlerden kurtulması ve bilgi yoğun görevlerde artan tatmin. Akademik katkı ve topluluk paylaşımı.  </w:t>
@@ -1394,6 +1538,7 @@
       </w:pPr>
       <w:r>
         <w:rPr>
+          <w:rFonts w:ascii="Times New Roman" w:cs="Times New Roman" w:eastAsia="Times New Roman" w:hAnsi="Times New Roman"/>
           <w:b w:val="1"/>
           <w:bCs w:val="1"/>
           <w:rtl w:val="0"/>
@@ -1402,6 +1547,7 @@
       </w:r>
       <w:r>
         <w:rPr>
+          <w:rFonts w:ascii="Times New Roman" w:cs="Times New Roman" w:eastAsia="Times New Roman" w:hAnsi="Times New Roman"/>
           <w:rtl w:val="0"/>
         </w:rPr>
         <w:t xml:space="preserve"> İş rolleri ve görev dağılımında yeniden yapılanma ihtiyacı.  </w:t>
@@ -1420,6 +1566,7 @@
       </w:pPr>
       <w:r>
         <w:rPr>
+          <w:rFonts w:ascii="Times New Roman" w:cs="Times New Roman" w:eastAsia="Times New Roman" w:hAnsi="Times New Roman"/>
           <w:b w:val="1"/>
           <w:bCs w:val="1"/>
           <w:rtl w:val="0"/>
@@ -1428,6 +1575,7 @@
       </w:r>
       <w:r>
         <w:rPr>
+          <w:rFonts w:ascii="Times New Roman" w:cs="Times New Roman" w:eastAsia="Times New Roman" w:hAnsi="Times New Roman"/>
           <w:rtl w:val="0"/>
         </w:rPr>
         <w:t xml:space="preserve"> Eğitim programları ve değişim yönetimi planı.</w:t>
@@ -1436,7 +1584,9 @@
     <w:p>
       <w:pPr>
         <w:ind w:left="1440" w:firstLine="0"/>
-        <w:rPr/>
+        <w:rPr>
+          <w:rFonts w:ascii="Times New Roman" w:cs="Times New Roman" w:eastAsia="Times New Roman" w:hAnsi="Times New Roman"/>
+        </w:rPr>
       </w:pPr>
       <w:r>
         <w:rPr>
@@ -1452,12 +1602,14 @@
         </w:numPr>
         <w:ind w:left="1440" w:hanging="360"/>
         <w:rPr>
-          <w:b w:val="1"/>
-          <w:bCs w:val="1"/>
-        </w:rPr>
-      </w:pPr>
-      <w:r>
-        <w:rPr>
+          <w:rFonts w:ascii="Times New Roman" w:cs="Times New Roman" w:eastAsia="Times New Roman" w:hAnsi="Times New Roman"/>
+          <w:b w:val="1"/>
+          <w:bCs w:val="1"/>
+        </w:rPr>
+      </w:pPr>
+      <w:r>
+        <w:rPr>
+          <w:rFonts w:ascii="Times New Roman" w:cs="Times New Roman" w:eastAsia="Times New Roman" w:hAnsi="Times New Roman"/>
           <w:b w:val="1"/>
           <w:bCs w:val="1"/>
           <w:rtl w:val="0"/>
@@ -1478,6 +1630,7 @@
       </w:pPr>
       <w:r>
         <w:rPr>
+          <w:rFonts w:ascii="Times New Roman" w:cs="Times New Roman" w:eastAsia="Times New Roman" w:hAnsi="Times New Roman"/>
           <w:b w:val="1"/>
           <w:bCs w:val="1"/>
           <w:rtl w:val="0"/>
@@ -1486,6 +1639,7 @@
       </w:r>
       <w:r>
         <w:rPr>
+          <w:rFonts w:ascii="Times New Roman" w:cs="Times New Roman" w:eastAsia="Times New Roman" w:hAnsi="Times New Roman"/>
           <w:rtl w:val="0"/>
         </w:rPr>
         <w:t xml:space="preserve"> Daha verimli kaynak kullanımı ve gereksiz altyapı yatırımının azaltılması.  </w:t>
@@ -1504,6 +1658,7 @@
       </w:pPr>
       <w:r>
         <w:rPr>
+          <w:rFonts w:ascii="Times New Roman" w:cs="Times New Roman" w:eastAsia="Times New Roman" w:hAnsi="Times New Roman"/>
           <w:b w:val="1"/>
           <w:bCs w:val="1"/>
           <w:rtl w:val="0"/>
@@ -1512,6 +1667,7 @@
       </w:r>
       <w:r>
         <w:rPr>
+          <w:rFonts w:ascii="Times New Roman" w:cs="Times New Roman" w:eastAsia="Times New Roman" w:hAnsi="Times New Roman"/>
           <w:rtl w:val="0"/>
         </w:rPr>
         <w:t xml:space="preserve"> Büyük modellerin eğitimi enerji tüketimi oluşturur.  </w:t>
@@ -1530,6 +1686,7 @@
       </w:pPr>
       <w:r>
         <w:rPr>
+          <w:rFonts w:ascii="Times New Roman" w:cs="Times New Roman" w:eastAsia="Times New Roman" w:hAnsi="Times New Roman"/>
           <w:b w:val="1"/>
           <w:bCs w:val="1"/>
           <w:rtl w:val="0"/>
@@ -1538,6 +1695,7 @@
       </w:r>
       <w:r>
         <w:rPr>
+          <w:rFonts w:ascii="Times New Roman" w:cs="Times New Roman" w:eastAsia="Times New Roman" w:hAnsi="Times New Roman"/>
           <w:rtl w:val="0"/>
         </w:rPr>
         <w:t xml:space="preserve"> Model sıkıştırma, verimli mimariler, eğitim zamanlarının optimize edilmesi ve enerji tüketimi takibi.</w:t>
@@ -1546,7 +1704,9 @@
     <w:p>
       <w:pPr>
         <w:ind w:left="1440" w:firstLine="0"/>
-        <w:rPr/>
+        <w:rPr>
+          <w:rFonts w:ascii="Times New Roman" w:cs="Times New Roman" w:eastAsia="Times New Roman" w:hAnsi="Times New Roman"/>
+        </w:rPr>
       </w:pPr>
       <w:r>
         <w:rPr>
@@ -1562,12 +1722,14 @@
         </w:numPr>
         <w:ind w:left="1440" w:hanging="360"/>
         <w:rPr>
-          <w:b w:val="1"/>
-          <w:bCs w:val="1"/>
-        </w:rPr>
-      </w:pPr>
-      <w:r>
-        <w:rPr>
+          <w:rFonts w:ascii="Times New Roman" w:cs="Times New Roman" w:eastAsia="Times New Roman" w:hAnsi="Times New Roman"/>
+          <w:b w:val="1"/>
+          <w:bCs w:val="1"/>
+        </w:rPr>
+      </w:pPr>
+      <w:r>
+        <w:rPr>
+          <w:rFonts w:ascii="Times New Roman" w:cs="Times New Roman" w:eastAsia="Times New Roman" w:hAnsi="Times New Roman"/>
           <w:b w:val="1"/>
           <w:bCs w:val="1"/>
           <w:rtl w:val="0"/>
@@ -1588,6 +1750,7 @@
       </w:pPr>
       <w:r>
         <w:rPr>
+          <w:rFonts w:ascii="Times New Roman" w:cs="Times New Roman" w:eastAsia="Times New Roman" w:hAnsi="Times New Roman"/>
           <w:b w:val="1"/>
           <w:bCs w:val="1"/>
           <w:rtl w:val="0"/>
@@ -1596,6 +1759,7 @@
       </w:r>
       <w:r>
         <w:rPr>
+          <w:rFonts w:ascii="Times New Roman" w:cs="Times New Roman" w:eastAsia="Times New Roman" w:hAnsi="Times New Roman"/>
           <w:rtl w:val="0"/>
         </w:rPr>
         <w:t xml:space="preserve"> Otomatik CVE analizleri ve önceliklendirme ile uyumluluk süreçlerinin güçlenmesi.  </w:t>
@@ -1614,6 +1778,7 @@
       </w:pPr>
       <w:r>
         <w:rPr>
+          <w:rFonts w:ascii="Times New Roman" w:cs="Times New Roman" w:eastAsia="Times New Roman" w:hAnsi="Times New Roman"/>
           <w:b w:val="1"/>
           <w:bCs w:val="1"/>
           <w:rtl w:val="0"/>
@@ -1622,6 +1787,7 @@
       </w:r>
       <w:r>
         <w:rPr>
+          <w:rFonts w:ascii="Times New Roman" w:cs="Times New Roman" w:eastAsia="Times New Roman" w:hAnsi="Times New Roman"/>
           <w:rtl w:val="0"/>
         </w:rPr>
         <w:t xml:space="preserve"> Kişisel veri işlenmesi, izinsiz testler.  </w:t>
@@ -1640,6 +1806,7 @@
       </w:pPr>
       <w:r>
         <w:rPr>
+          <w:rFonts w:ascii="Times New Roman" w:cs="Times New Roman" w:eastAsia="Times New Roman" w:hAnsi="Times New Roman"/>
           <w:b w:val="1"/>
           <w:bCs w:val="1"/>
           <w:rtl w:val="0"/>
@@ -1648,6 +1815,7 @@
       </w:r>
       <w:r>
         <w:rPr>
+          <w:rFonts w:ascii="Times New Roman" w:cs="Times New Roman" w:eastAsia="Times New Roman" w:hAnsi="Times New Roman"/>
           <w:rtl w:val="0"/>
         </w:rPr>
         <w:t xml:space="preserve"> Veri minimizasyonu, anonimleştirme, açık onay süreçleri ve hukuki danışmanlık. Uygun kayıt ve dokümantasyon saklanacak.</w:t>
@@ -1656,7 +1824,9 @@
     <w:p>
       <w:pPr>
         <w:ind w:left="1440" w:firstLine="0"/>
-        <w:rPr/>
+        <w:rPr>
+          <w:rFonts w:ascii="Times New Roman" w:cs="Times New Roman" w:eastAsia="Times New Roman" w:hAnsi="Times New Roman"/>
+        </w:rPr>
       </w:pPr>
       <w:r>
         <w:rPr>
@@ -1672,12 +1842,14 @@
         </w:numPr>
         <w:ind w:left="1440" w:hanging="360"/>
         <w:rPr>
-          <w:b w:val="1"/>
-          <w:bCs w:val="1"/>
-        </w:rPr>
-      </w:pPr>
-      <w:r>
-        <w:rPr>
+          <w:rFonts w:ascii="Times New Roman" w:cs="Times New Roman" w:eastAsia="Times New Roman" w:hAnsi="Times New Roman"/>
+          <w:b w:val="1"/>
+          <w:bCs w:val="1"/>
+        </w:rPr>
+      </w:pPr>
+      <w:r>
+        <w:rPr>
+          <w:rFonts w:ascii="Times New Roman" w:cs="Times New Roman" w:eastAsia="Times New Roman" w:hAnsi="Times New Roman"/>
           <w:b w:val="1"/>
           <w:bCs w:val="1"/>
           <w:rtl w:val="0"/>
@@ -1698,6 +1870,7 @@
       </w:pPr>
       <w:r>
         <w:rPr>
+          <w:rFonts w:ascii="Times New Roman" w:cs="Times New Roman" w:eastAsia="Times New Roman" w:hAnsi="Times New Roman"/>
           <w:b w:val="1"/>
           <w:bCs w:val="1"/>
           <w:rtl w:val="0"/>
@@ -1706,6 +1879,7 @@
       </w:r>
       <w:r>
         <w:rPr>
+          <w:rFonts w:ascii="Times New Roman" w:cs="Times New Roman" w:eastAsia="Times New Roman" w:hAnsi="Times New Roman"/>
           <w:rtl w:val="0"/>
         </w:rPr>
         <w:t xml:space="preserve"> Azalan alarm yorgunluğu sayesinde analistlerin stres düzeyinde azalma, daha iyi iş-yaşam dengesi.  </w:t>
@@ -1724,6 +1898,7 @@
       </w:pPr>
       <w:r>
         <w:rPr>
+          <w:rFonts w:ascii="Times New Roman" w:cs="Times New Roman" w:eastAsia="Times New Roman" w:hAnsi="Times New Roman"/>
           <w:b w:val="1"/>
           <w:bCs w:val="1"/>
           <w:rtl w:val="0"/>
@@ -1732,6 +1907,7 @@
       </w:r>
       <w:r>
         <w:rPr>
+          <w:rFonts w:ascii="Times New Roman" w:cs="Times New Roman" w:eastAsia="Times New Roman" w:hAnsi="Times New Roman"/>
           <w:rtl w:val="0"/>
         </w:rPr>
         <w:t xml:space="preserve"> Otomasyona aşırı güven, kritik durumlarda insan müdahalesinin azalması.  </w:t>
@@ -1750,6 +1926,7 @@
       </w:pPr>
       <w:r>
         <w:rPr>
+          <w:rFonts w:ascii="Times New Roman" w:cs="Times New Roman" w:eastAsia="Times New Roman" w:hAnsi="Times New Roman"/>
           <w:b w:val="1"/>
           <w:bCs w:val="1"/>
           <w:rtl w:val="0"/>
@@ -1758,6 +1935,7 @@
       </w:r>
       <w:r>
         <w:rPr>
+          <w:rFonts w:ascii="Times New Roman" w:cs="Times New Roman" w:eastAsia="Times New Roman" w:hAnsi="Times New Roman"/>
           <w:rtl w:val="0"/>
         </w:rPr>
         <w:t xml:space="preserve"> İnsan onaylı kritik kararlar, ergonomik uyarı tasarımları ve operatör rotasyonları.</w:t>
@@ -1766,10 +1944,13 @@
     <w:p>
       <w:pPr>
         <w:ind w:left="1440" w:firstLine="0"/>
-        <w:rPr/>
-      </w:pPr>
-      <w:r>
-        <w:rPr>
+        <w:rPr>
+          <w:rFonts w:ascii="Times New Roman" w:cs="Times New Roman" w:eastAsia="Times New Roman" w:hAnsi="Times New Roman"/>
+        </w:rPr>
+      </w:pPr>
+      <w:r>
+        <w:rPr>
+          <w:rFonts w:ascii="Times New Roman" w:cs="Times New Roman" w:eastAsia="Times New Roman" w:hAnsi="Times New Roman"/>
           <w:rtl w:val="0"/>
         </w:rPr>
         <w:br w:type="textWrapping"/>
@@ -1778,7 +1959,9 @@
     <w:p>
       <w:pPr>
         <w:ind w:left="1440" w:firstLine="0"/>
-        <w:rPr/>
+        <w:rPr>
+          <w:rFonts w:ascii="Times New Roman" w:cs="Times New Roman" w:eastAsia="Times New Roman" w:hAnsi="Times New Roman"/>
+        </w:rPr>
       </w:pPr>
       <w:r>
         <w:rPr>
@@ -1794,12 +1977,14 @@
         </w:numPr>
         <w:ind w:left="1440" w:hanging="360"/>
         <w:rPr>
-          <w:b w:val="1"/>
-          <w:bCs w:val="1"/>
-        </w:rPr>
-      </w:pPr>
-      <w:r>
-        <w:rPr>
+          <w:rFonts w:ascii="Times New Roman" w:cs="Times New Roman" w:eastAsia="Times New Roman" w:hAnsi="Times New Roman"/>
+          <w:b w:val="1"/>
+          <w:bCs w:val="1"/>
+        </w:rPr>
+      </w:pPr>
+      <w:r>
+        <w:rPr>
+          <w:rFonts w:ascii="Times New Roman" w:cs="Times New Roman" w:eastAsia="Times New Roman" w:hAnsi="Times New Roman"/>
           <w:b w:val="1"/>
           <w:bCs w:val="1"/>
           <w:rtl w:val="0"/>
@@ -1820,6 +2005,7 @@
       </w:pPr>
       <w:r>
         <w:rPr>
+          <w:rFonts w:ascii="Times New Roman" w:cs="Times New Roman" w:eastAsia="Times New Roman" w:hAnsi="Times New Roman"/>
           <w:b w:val="1"/>
           <w:bCs w:val="1"/>
           <w:rtl w:val="0"/>
@@ -1828,6 +2014,7 @@
       </w:r>
       <w:r>
         <w:rPr>
+          <w:rFonts w:ascii="Times New Roman" w:cs="Times New Roman" w:eastAsia="Times New Roman" w:hAnsi="Times New Roman"/>
           <w:rtl w:val="0"/>
         </w:rPr>
         <w:t xml:space="preserve"> Gelişmiş tehdit tespit doğruluğu ve CTI entegrasyonu ile daha kaliteli istihbarat ve hızlı tespit/müdahale.  </w:t>
@@ -1846,6 +2033,7 @@
       </w:pPr>
       <w:r>
         <w:rPr>
+          <w:rFonts w:ascii="Times New Roman" w:cs="Times New Roman" w:eastAsia="Times New Roman" w:hAnsi="Times New Roman"/>
           <w:b w:val="1"/>
           <w:bCs w:val="1"/>
           <w:rtl w:val="0"/>
@@ -1854,6 +2042,7 @@
       </w:r>
       <w:r>
         <w:rPr>
+          <w:rFonts w:ascii="Times New Roman" w:cs="Times New Roman" w:eastAsia="Times New Roman" w:hAnsi="Times New Roman"/>
           <w:rtl w:val="0"/>
         </w:rPr>
         <w:t xml:space="preserve"> Platformun kendisinin hedef olması, adversarial ML ve veri zehirleme tehditleri.  </w:t>
@@ -1872,6 +2061,7 @@
       </w:pPr>
       <w:r>
         <w:rPr>
+          <w:rFonts w:ascii="Times New Roman" w:cs="Times New Roman" w:eastAsia="Times New Roman" w:hAnsi="Times New Roman"/>
           <w:b w:val="1"/>
           <w:bCs w:val="1"/>
           <w:rtl w:val="0"/>
@@ -1880,6 +2070,7 @@
       </w:r>
       <w:r>
         <w:rPr>
+          <w:rFonts w:ascii="Times New Roman" w:cs="Times New Roman" w:eastAsia="Times New Roman" w:hAnsi="Times New Roman"/>
           <w:rtl w:val="0"/>
         </w:rPr>
         <w:t xml:space="preserve"> Güçlü erişim kontrolleri, şifreleme, güvenlik testleri, adversarial dayanıklılık testleri ve düzenli denetimler.</w:t>

</xml_diff>